<commit_message>
Refine code comments and update validation records
</commit_message>
<xml_diff>
--- a/OTA 通信协议.docx
+++ b/OTA 通信协议.docx
@@ -1,6 +1,6 @@
 
 <file path=word/document.xml><?xml version="1.0" encoding="utf-8"?>
-<w:document xmlns:wpc="http://schemas.microsoft.com/office/word/2010/wordprocessingCanvas" xmlns:cx="http://schemas.microsoft.com/office/drawing/2014/chartex" xmlns:cx1="http://schemas.microsoft.com/office/drawing/2015/9/8/chartex" xmlns:cx2="http://schemas.microsoft.com/office/drawing/2015/10/21/chartex" xmlns:cx3="http://schemas.microsoft.com/office/drawing/2016/5/9/chartex" xmlns:cx4="http://schemas.microsoft.com/office/drawing/2016/5/10/chartex" xmlns:cx5="http://schemas.microsoft.com/office/drawing/2016/5/11/chartex" xmlns:cx6="http://schemas.microsoft.com/office/drawing/2016/5/12/chartex" xmlns:cx7="http://schemas.microsoft.com/office/drawing/2016/5/13/chartex" xmlns:cx8="http://schemas.microsoft.com/office/drawing/2016/5/14/chartex" xmlns:mc="http://schemas.openxmlformats.org/markup-compatibility/2006" xmlns:aink="http://schemas.microsoft.com/office/drawing/2016/ink" xmlns:am3d="http://schemas.microsoft.com/office/drawing/2017/model3d" xmlns:o="urn:schemas-microsoft-com:office:office" xmlns:oel="http://schemas.microsoft.com/office/2019/extlst" xmlns:r="http://schemas.openxmlformats.org/officeDocument/2006/relationships" xmlns:m="http://schemas.openxmlformats.org/officeDocument/2006/math" xmlns:v="urn:schemas-microsoft-com:vml" xmlns:wp14="http://schemas.microsoft.com/office/word/2010/wordprocessingDrawing" xmlns:wp="http://schemas.openxmlformats.org/drawingml/2006/wordprocessingDrawing" xmlns:w10="urn:schemas-microsoft-com:office:word" xmlns:w="http://schemas.openxmlformats.org/wordprocessingml/2006/main" xmlns:w14="http://schemas.microsoft.com/office/word/2010/wordml" xmlns:w15="http://schemas.microsoft.com/office/word/2012/wordml" xmlns:w16cei="http://schemas.microsoft.com/office/word/2026/wordml/cei" xmlns:w16cex="http://schemas.microsoft.com/office/word/2018/wordml/cex" xmlns:w16cid="http://schemas.microsoft.com/office/word/2016/wordml/cid" xmlns:w16="http://schemas.microsoft.com/office/word/2018/wordml" xmlns:w16du="http://schemas.microsoft.com/office/word/2023/wordml/word16du" xmlns:w16sdtdh="http://schemas.microsoft.com/office/word/2020/wordml/sdtdatahash" xmlns:w16sdtfl="http://schemas.microsoft.com/office/word/2024/wordml/sdtformatlock" xmlns:w16se="http://schemas.microsoft.com/office/word/2015/wordml/symex" xmlns:wpg="http://schemas.microsoft.com/office/word/2010/wordprocessingGroup" xmlns:wpi="http://schemas.microsoft.com/office/word/2010/wordprocessingInk" xmlns:wne="http://schemas.microsoft.com/office/word/2006/wordml" xmlns:wps="http://schemas.microsoft.com/office/word/2010/wordprocessingShape" mc:Ignorable="w14 w15 w16se w16cid w16 w16cex w16sdtdh w16sdtfl w16du wp14">
+<w:document xmlns:wpc="http://schemas.microsoft.com/office/word/2010/wordprocessingCanvas" xmlns:cx="http://schemas.microsoft.com/office/drawing/2014/chartex" xmlns:cx1="http://schemas.microsoft.com/office/drawing/2015/9/8/chartex" xmlns:cx2="http://schemas.microsoft.com/office/drawing/2015/10/21/chartex" xmlns:cx3="http://schemas.microsoft.com/office/drawing/2016/5/9/chartex" xmlns:cx4="http://schemas.microsoft.com/office/drawing/2016/5/10/chartex" xmlns:cx5="http://schemas.microsoft.com/office/drawing/2016/5/11/chartex" xmlns:cx6="http://schemas.microsoft.com/office/drawing/2016/5/12/chartex" xmlns:cx7="http://schemas.microsoft.com/office/drawing/2016/5/13/chartex" xmlns:cx8="http://schemas.microsoft.com/office/drawing/2016/5/14/chartex" xmlns:mc="http://schemas.openxmlformats.org/markup-compatibility/2006" xmlns:aink="http://schemas.microsoft.com/office/drawing/2016/ink" xmlns:am3d="http://schemas.microsoft.com/office/drawing/2017/model3d" xmlns:o="urn:schemas-microsoft-com:office:office" xmlns:oel="http://schemas.microsoft.com/office/2019/extlst" xmlns:r="http://schemas.openxmlformats.org/officeDocument/2006/relationships" xmlns:m="http://schemas.openxmlformats.org/officeDocument/2006/math" xmlns:v="urn:schemas-microsoft-com:vml" xmlns:wp14="http://schemas.microsoft.com/office/word/2010/wordprocessingDrawing" xmlns:wp="http://schemas.openxmlformats.org/drawingml/2006/wordprocessingDrawing" xmlns:w10="urn:schemas-microsoft-com:office:word" xmlns:w="http://schemas.openxmlformats.org/wordprocessingml/2006/main" xmlns:w14="http://schemas.microsoft.com/office/word/2010/wordml" xmlns:w15="http://schemas.microsoft.com/office/word/2012/wordml" xmlns:w16cex="http://schemas.microsoft.com/office/word/2018/wordml/cex" xmlns:w16cid="http://schemas.microsoft.com/office/word/2016/wordml/cid" xmlns:w16="http://schemas.microsoft.com/office/word/2018/wordml" xmlns:w16du="http://schemas.microsoft.com/office/word/2023/wordml/word16du" xmlns:w16sdtdh="http://schemas.microsoft.com/office/word/2020/wordml/sdtdatahash" xmlns:w16sdtfl="http://schemas.microsoft.com/office/word/2024/wordml/sdtformatlock" xmlns:w16se="http://schemas.microsoft.com/office/word/2015/wordml/symex" xmlns:wpg="http://schemas.microsoft.com/office/word/2010/wordprocessingGroup" xmlns:wpi="http://schemas.microsoft.com/office/word/2010/wordprocessingInk" xmlns:wne="http://schemas.microsoft.com/office/word/2006/wordml" xmlns:wps="http://schemas.microsoft.com/office/word/2010/wordprocessingShape" mc:Ignorable="w14 w15 w16se w16cid w16 w16cex w16sdtdh w16sdtfl w16du wp14">
   <w:body>
     <w:p>
       <w:pPr>
@@ -59,9 +59,6 @@
     <w:p>
       <w:pPr>
         <w:pStyle w:val="FirstParagraph"/>
-        <w:rPr>
-          <w:rFonts w:hint="eastAsia"/>
-        </w:rPr>
       </w:pPr>
       <w:r>
         <w:rPr>
@@ -82,7 +79,49 @@
         <w:rPr>
           <w:rFonts w:hint="eastAsia"/>
         </w:rPr>
-        <w:t>Waveshare</w:t>
+        <w:t>Waveshare ESP32-S3-LCD-1.85</w:t>
+      </w:r>
+      <w:r>
+        <w:rPr>
+          <w:rFonts w:hint="eastAsia"/>
+        </w:rPr>
+        <w:t>（</w:t>
+      </w:r>
+      <w:r>
+        <w:rPr>
+          <w:rFonts w:hint="eastAsia"/>
+        </w:rPr>
+        <w:t>ESP32-S3R8</w:t>
+      </w:r>
+      <w:r>
+        <w:rPr>
+          <w:rFonts w:hint="eastAsia"/>
+        </w:rPr>
+        <w:t>）</w:t>
+      </w:r>
+      <w:r>
+        <w:rPr>
+          <w:rFonts w:hint="eastAsia"/>
+        </w:rPr>
+        <w:t>）的固件远程升级（</w:t>
+      </w:r>
+      <w:r>
+        <w:rPr>
+          <w:rFonts w:hint="eastAsia"/>
+        </w:rPr>
+        <w:t>OTA</w:t>
+      </w:r>
+      <w:r>
+        <w:rPr>
+          <w:rFonts w:hint="eastAsia"/>
+        </w:rPr>
+        <w:t>）通信协议，规范终端与云端（</w:t>
+      </w:r>
+      <w:r>
+        <w:rPr>
+          <w:rFonts w:hint="eastAsia"/>
+        </w:rPr>
+        <w:t>MQTT</w:t>
       </w:r>
       <w:r>
         <w:t xml:space="preserve"> </w:t>
@@ -91,39 +130,6 @@
         <w:rPr>
           <w:rFonts w:hint="eastAsia"/>
         </w:rPr>
-        <w:t>ESP32-S3R8</w:t>
-      </w:r>
-      <w:r>
-        <w:rPr>
-          <w:rFonts w:hint="eastAsia"/>
-        </w:rPr>
-        <w:t>）的固件远程升级（</w:t>
-      </w:r>
-      <w:r>
-        <w:rPr>
-          <w:rFonts w:hint="eastAsia"/>
-        </w:rPr>
-        <w:t>OTA</w:t>
-      </w:r>
-      <w:r>
-        <w:rPr>
-          <w:rFonts w:hint="eastAsia"/>
-        </w:rPr>
-        <w:t>）通信协议，规范终端与云端（</w:t>
-      </w:r>
-      <w:r>
-        <w:rPr>
-          <w:rFonts w:hint="eastAsia"/>
-        </w:rPr>
-        <w:t>MQTT</w:t>
-      </w:r>
-      <w:r>
-        <w:t xml:space="preserve"> </w:t>
-      </w:r>
-      <w:r>
-        <w:rPr>
-          <w:rFonts w:hint="eastAsia"/>
-        </w:rPr>
         <w:t>Broker</w:t>
       </w:r>
       <w:r>
@@ -139,25 +145,49 @@
         <w:rPr>
           <w:rFonts w:hint="eastAsia"/>
         </w:rPr>
-        <w:t>长连接承载全部元数据报文（版本检查、升级判定、服务端通知、状态上报），数据面经</w:t>
-      </w:r>
-      <w:r>
+        <w:t>长连接承载全部元数据报文（版本检查、升级判定、服务端通知、状态上报），</w:t>
+      </w:r>
+      <w:r>
+        <w:rPr>
+          <w:rFonts w:hint="eastAsia"/>
+        </w:rPr>
+        <w:t>数据面经</w:t>
+      </w:r>
+      <w:r>
+        <w:rPr>
+          <w:rFonts w:hint="eastAsia"/>
+        </w:rPr>
         <w:t xml:space="preserve"> HTTPS </w:t>
       </w:r>
       <w:r>
         <w:rPr>
           <w:rFonts w:hint="eastAsia"/>
         </w:rPr>
-        <w:t>短连接承载固件二进制下载，支持</w:t>
-      </w:r>
-      <w:r>
+        <w:t>短连接承载固件二进制下载，保留</w:t>
+      </w:r>
+      <w:r>
+        <w:rPr>
+          <w:rFonts w:hint="eastAsia"/>
+        </w:rPr>
         <w:t xml:space="preserve"> Range </w:t>
       </w:r>
       <w:r>
         <w:rPr>
           <w:rFonts w:hint="eastAsia"/>
         </w:rPr>
-        <w:t>断点续传；</w:t>
+        <w:t>请求与断点记录；当前构建的</w:t>
+      </w:r>
+      <w:r>
+        <w:rPr>
+          <w:rFonts w:hint="eastAsia"/>
+        </w:rPr>
+        <w:t xml:space="preserve"> 206 </w:t>
+      </w:r>
+      <w:r>
+        <w:rPr>
+          <w:rFonts w:hint="eastAsia"/>
+        </w:rPr>
+        <w:t>恢复受响应头接口限制，不能承诺已具备可用的断点续传；</w:t>
       </w:r>
       <w:r>
         <w:t>所有网络连接均由终端主动建立，服务器不主动建立到终端的连接；服务器可通过已建立的</w:t>
@@ -208,16 +238,25 @@
         <w:rPr>
           <w:rFonts w:hint="eastAsia"/>
         </w:rPr>
-        <w:t>Waveshare</w:t>
-      </w:r>
-      <w:r>
-        <w:t xml:space="preserve"> </w:t>
+        <w:t>Waveshare ESP32-S3-LCD-1.85</w:t>
+      </w:r>
+      <w:r>
+        <w:rPr>
+          <w:rFonts w:hint="eastAsia"/>
+        </w:rPr>
+        <w:t>（</w:t>
       </w:r>
       <w:r>
         <w:rPr>
           <w:rFonts w:hint="eastAsia"/>
         </w:rPr>
         <w:t>ESP32-S3R8</w:t>
+      </w:r>
+      <w:r>
+        <w:rPr>
+          <w:rFonts w:hint="eastAsia"/>
+        </w:rPr>
+        <w:t>）</w:t>
       </w:r>
       <w:r>
         <w:rPr>
@@ -259,16 +298,7 @@
         <w:rPr>
           <w:rFonts w:hint="eastAsia"/>
         </w:rPr>
-        <w:t>ESP-IDF</w:t>
-      </w:r>
-      <w:r>
-        <w:t xml:space="preserve"> </w:t>
-      </w:r>
-      <w:r>
-        <w:rPr>
-          <w:rFonts w:hint="eastAsia"/>
-        </w:rPr>
-        <w:t>v6.0.2</w:t>
+        <w:t>ESP-IDF 5.5.4</w:t>
       </w:r>
       <w:r>
         <w:rPr>
@@ -1259,6 +1289,7 @@
           <w:docPartUnique/>
         </w:docPartObj>
       </w:sdtPr>
+      <w:sdtEndPr/>
       <w:sdtContent>
         <w:p>
           <w:pPr>
@@ -2360,7 +2391,6 @@
       </w:pPr>
       <w:bookmarkStart w:id="1" w:name="_Toc238037776"/>
       <w:r>
-        <w:lastRenderedPageBreak/>
         <w:t xml:space="preserve">1. </w:t>
       </w:r>
       <w:r>
@@ -2592,7 +2622,6 @@
         <w:rPr>
           <w:rFonts w:hint="eastAsia"/>
         </w:rPr>
-        <w:lastRenderedPageBreak/>
         <w:t>固件服务器：存储固件二进制，响应</w:t>
       </w:r>
       <w:r>
@@ -3223,7 +3252,7 @@
         <w:rPr>
           <w:rStyle w:val="VerbatimChar"/>
         </w:rPr>
-        <w:t>main/ota_control_plane.c</w:t>
+        <w:t>main/ota/ota_control_plane.c</w:t>
       </w:r>
       <w:r>
         <w:t xml:space="preserve"> </w:t>
@@ -3355,7 +3384,6 @@
         <w:rPr>
           <w:rFonts w:hint="eastAsia"/>
         </w:rPr>
-        <w:lastRenderedPageBreak/>
         <w:t>稳定性：基于</w:t>
       </w:r>
       <w:r>
@@ -3412,7 +3440,6 @@
       <w:bookmarkEnd w:id="0"/>
       <w:bookmarkEnd w:id="4"/>
       <w:r>
-        <w:lastRenderedPageBreak/>
         <w:t xml:space="preserve">2. </w:t>
       </w:r>
       <w:r>
@@ -4170,7 +4197,6 @@
         <w:rPr>
           <w:rFonts w:hint="eastAsia"/>
         </w:rPr>
-        <w:lastRenderedPageBreak/>
         <w:t>“分片”指</w:t>
       </w:r>
       <w:r>
@@ -4225,7 +4251,7 @@
         <w:rPr>
           <w:rStyle w:val="VerbatimChar"/>
         </w:rPr>
-        <w:t>main/mqtt_comm.c</w:t>
+        <w:t>main/network/mqtt_comm.c</w:t>
       </w:r>
       <w:r>
         <w:rPr>
@@ -4536,7 +4562,19 @@
         <w:rPr>
           <w:rStyle w:val="StringTok"/>
         </w:rPr>
-        <w:t>"native-ota-device"</w:t>
+        <w:t>"</w:t>
+      </w:r>
+      <w:r>
+        <w:rPr>
+          <w:rStyle w:val="StringTok"/>
+        </w:rPr>
+        <w:t>julia-ai-device</w:t>
+      </w:r>
+      <w:r>
+        <w:rPr>
+          <w:rStyle w:val="StringTok"/>
+        </w:rPr>
+        <w:t>"</w:t>
       </w:r>
       <w:r>
         <w:rPr>
@@ -5349,7 +5387,7 @@
                 <w:sz w:val="20"/>
                 <w:szCs w:val="20"/>
               </w:rPr>
-              <w:t>native-ota-device</w:t>
+              <w:t>julia-ai-device</w:t>
             </w:r>
           </w:p>
         </w:tc>
@@ -5369,7 +5407,6 @@
                 <w:sz w:val="20"/>
                 <w:szCs w:val="20"/>
               </w:rPr>
-              <w:lastRenderedPageBreak/>
               <w:t>hardware_version</w:t>
             </w:r>
           </w:p>
@@ -6026,7 +6063,19 @@
         <w:rPr>
           <w:rStyle w:val="StringTok"/>
         </w:rPr>
-        <w:t>"native-ota-device"</w:t>
+        <w:t>"</w:t>
+      </w:r>
+      <w:r>
+        <w:rPr>
+          <w:rStyle w:val="StringTok"/>
+        </w:rPr>
+        <w:t>julia-ai-device</w:t>
+      </w:r>
+      <w:r>
+        <w:rPr>
+          <w:rStyle w:val="StringTok"/>
+        </w:rPr>
+        <w:t>"</w:t>
       </w:r>
       <w:r>
         <w:rPr>
@@ -6492,16 +6541,7 @@
                 <w:sz w:val="20"/>
                 <w:szCs w:val="20"/>
               </w:rPr>
-              <w:t>必须等于请求中</w:t>
-            </w:r>
-            <w:r>
-              <w:rPr>
-                <w:rFonts w:hint="eastAsia"/>
-                <w:sz w:val="20"/>
-                <w:szCs w:val="20"/>
-              </w:rPr>
-              <w:lastRenderedPageBreak/>
-              <w:t>的</w:t>
+              <w:t>必须等于请求中的</w:t>
             </w:r>
             <w:r>
               <w:rPr>
@@ -6541,17 +6581,7 @@
                 <w:sz w:val="20"/>
                 <w:szCs w:val="20"/>
               </w:rPr>
-              <w:lastRenderedPageBreak/>
-              <w:t>把响应与一次具</w:t>
-            </w:r>
-            <w:r>
-              <w:rPr>
-                <w:rFonts w:hint="eastAsia"/>
-                <w:sz w:val="20"/>
-                <w:szCs w:val="20"/>
-              </w:rPr>
-              <w:lastRenderedPageBreak/>
-              <w:t>体检查请求关联；设备要求与最近一次检查请求的</w:t>
+              <w:t>把响应与一次具体检查请求关联；设备要求与最近一次检查请求的</w:t>
             </w:r>
             <w:r>
               <w:rPr>
@@ -6601,7 +6631,6 @@
                 <w:sz w:val="20"/>
                 <w:szCs w:val="20"/>
               </w:rPr>
-              <w:lastRenderedPageBreak/>
               <w:t>device_id</w:t>
             </w:r>
           </w:p>
@@ -7580,7 +7609,19 @@
         <w:rPr>
           <w:rStyle w:val="StringTok"/>
         </w:rPr>
-        <w:t>"native-ota-device"</w:t>
+        <w:t>"</w:t>
+      </w:r>
+      <w:r>
+        <w:rPr>
+          <w:rStyle w:val="StringTok"/>
+        </w:rPr>
+        <w:t>julia-ai-device</w:t>
+      </w:r>
+      <w:r>
+        <w:rPr>
+          <w:rStyle w:val="StringTok"/>
+        </w:rPr>
+        <w:t>"</w:t>
       </w:r>
       <w:r>
         <w:rPr>
@@ -7595,7 +7636,6 @@
         <w:rPr>
           <w:rStyle w:val="NormalTok"/>
         </w:rPr>
-        <w:lastRenderedPageBreak/>
         <w:t xml:space="preserve">  </w:t>
       </w:r>
       <w:r>
@@ -7737,7 +7777,19 @@
         <w:rPr>
           <w:rStyle w:val="StringTok"/>
         </w:rPr>
-        <w:t>"native-ota-device-2-001"</w:t>
+        <w:t>"</w:t>
+      </w:r>
+      <w:r>
+        <w:rPr>
+          <w:rStyle w:val="StringTok"/>
+        </w:rPr>
+        <w:t>julia-ai-device</w:t>
+      </w:r>
+      <w:r>
+        <w:rPr>
+          <w:rStyle w:val="StringTok"/>
+        </w:rPr>
+        <w:t>-2-001"</w:t>
       </w:r>
       <w:r>
         <w:rPr>
@@ -8957,7 +9009,6 @@
                 <w:sz w:val="20"/>
                 <w:szCs w:val="20"/>
               </w:rPr>
-              <w:lastRenderedPageBreak/>
               <w:t>job_id</w:t>
             </w:r>
           </w:p>
@@ -9889,16 +9940,7 @@
                 <w:sz w:val="20"/>
                 <w:szCs w:val="20"/>
               </w:rPr>
-              <w:t>主机必须满足设备配置的允</w:t>
-            </w:r>
-            <w:r>
-              <w:rPr>
-                <w:rFonts w:hint="eastAsia"/>
-                <w:sz w:val="20"/>
-                <w:szCs w:val="20"/>
-              </w:rPr>
-              <w:lastRenderedPageBreak/>
-              <w:t>许列表</w:t>
+              <w:t>主机必须满足设备配置的允许列表</w:t>
             </w:r>
           </w:p>
         </w:tc>
@@ -9918,7 +9960,6 @@
                 <w:sz w:val="20"/>
                 <w:szCs w:val="20"/>
               </w:rPr>
-              <w:lastRenderedPageBreak/>
               <w:t>image_size</w:t>
             </w:r>
           </w:p>
@@ -10747,7 +10788,6 @@
         <w:rPr>
           <w:rFonts w:hint="eastAsia"/>
         </w:rPr>
-        <w:lastRenderedPageBreak/>
         <w:t>有效期（</w:t>
       </w:r>
       <w:r>
@@ -11704,7 +11744,6 @@
         <w:rPr>
           <w:rFonts w:hint="eastAsia"/>
         </w:rPr>
-        <w:lastRenderedPageBreak/>
         <w:t>报文（</w:t>
       </w:r>
       <w:r>
@@ -11988,7 +12027,19 @@
         <w:rPr>
           <w:rStyle w:val="StringTok"/>
         </w:rPr>
-        <w:t>"native-ota-device-2-001"</w:t>
+        <w:t>"</w:t>
+      </w:r>
+      <w:r>
+        <w:rPr>
+          <w:rStyle w:val="StringTok"/>
+        </w:rPr>
+        <w:t>julia-ai-device</w:t>
+      </w:r>
+      <w:r>
+        <w:rPr>
+          <w:rStyle w:val="StringTok"/>
+        </w:rPr>
+        <w:t>-2-001"</w:t>
       </w:r>
       <w:r>
         <w:rPr>
@@ -12027,7 +12078,19 @@
         <w:rPr>
           <w:rStyle w:val="StringTok"/>
         </w:rPr>
-        <w:t>"native-ota-device"</w:t>
+        <w:t>"</w:t>
+      </w:r>
+      <w:r>
+        <w:rPr>
+          <w:rStyle w:val="StringTok"/>
+        </w:rPr>
+        <w:t>julia-ai-device</w:t>
+      </w:r>
+      <w:r>
+        <w:rPr>
+          <w:rStyle w:val="StringTok"/>
+        </w:rPr>
+        <w:t>"</w:t>
       </w:r>
       <w:r>
         <w:rPr>
@@ -13557,7 +13620,6 @@
                 <w:sz w:val="20"/>
                 <w:szCs w:val="20"/>
               </w:rPr>
-              <w:lastRenderedPageBreak/>
               <w:t>current_version</w:t>
             </w:r>
           </w:p>
@@ -15207,7 +15269,6 @@
                 <w:sz w:val="20"/>
                 <w:szCs w:val="20"/>
               </w:rPr>
-              <w:lastRenderedPageBreak/>
               <w:t>deferred</w:t>
             </w:r>
           </w:p>
@@ -16218,7 +16279,6 @@
         <w:rPr>
           <w:rFonts w:hint="eastAsia"/>
         </w:rPr>
-        <w:lastRenderedPageBreak/>
         <w:t>完整性要求</w:t>
       </w:r>
     </w:p>
@@ -16297,22 +16357,52 @@
         <w:t>固件内容必须是未压缩、未转换的原始</w:t>
       </w:r>
       <w:r>
-        <w:t xml:space="preserve"> </w:t>
-      </w:r>
-      <w:r>
-        <w:rPr>
-          <w:rStyle w:val="VerbatimChar"/>
-        </w:rPr>
-        <w:t>.bin</w:t>
-      </w:r>
-      <w:r>
-        <w:t xml:space="preserve"> </w:t>
-      </w:r>
-      <w:r>
-        <w:rPr>
-          <w:rFonts w:hint="eastAsia"/>
-        </w:rPr>
-        <w:t>字节。</w:t>
+        <w:rPr>
+          <w:rFonts w:hint="eastAsia"/>
+        </w:rPr>
+        <w:t xml:space="preserve"> .bin </w:t>
+      </w:r>
+      <w:r>
+        <w:rPr>
+          <w:rFonts w:hint="eastAsia"/>
+        </w:rPr>
+        <w:t>字节。当前</w:t>
+      </w:r>
+      <w:r>
+        <w:rPr>
+          <w:rFonts w:hint="eastAsia"/>
+        </w:rPr>
+        <w:t xml:space="preserve"> ESP-IDF 5.5.4 </w:t>
+      </w:r>
+      <w:r>
+        <w:rPr>
+          <w:rFonts w:hint="eastAsia"/>
+        </w:rPr>
+        <w:t>构建缺少校验</w:t>
+      </w:r>
+      <w:r>
+        <w:rPr>
+          <w:rFonts w:hint="eastAsia"/>
+        </w:rPr>
+        <w:t xml:space="preserve"> 206 </w:t>
+      </w:r>
+      <w:r>
+        <w:rPr>
+          <w:rFonts w:hint="eastAsia"/>
+        </w:rPr>
+        <w:t>所需的响应头接口，因此只能把</w:t>
+      </w:r>
+      <w:r>
+        <w:rPr>
+          <w:rFonts w:hint="eastAsia"/>
+        </w:rPr>
+        <w:t xml:space="preserve"> Range </w:t>
+      </w:r>
+      <w:r>
+        <w:rPr>
+          <w:rFonts w:hint="eastAsia"/>
+        </w:rPr>
+        <w:t>视为待验证实现，不能作为已交付能力。</w:t>
       </w:r>
     </w:p>
     <w:p>
@@ -16491,7 +16581,6 @@
         <w:rPr>
           <w:noProof/>
         </w:rPr>
-        <w:lastRenderedPageBreak/>
         <w:drawing>
           <wp:inline distT="0" distB="0" distL="0" distR="0" wp14:anchorId="16EA6E52" wp14:editId="5AAEDCE4">
             <wp:extent cx="5372100" cy="3467100"/>
@@ -16671,7 +16760,6 @@
           <w:b/>
           <w:bCs/>
         </w:rPr>
-        <w:lastRenderedPageBreak/>
         <w:t>检查响应：</w:t>
       </w:r>
       <w:r>
@@ -17449,7 +17537,73 @@
                 <w:sz w:val="20"/>
                 <w:szCs w:val="20"/>
               </w:rPr>
-              <w:t>保留有效断点，重连后按</w:t>
+              <w:t>保留有效断点并发起</w:t>
+            </w:r>
+            <w:r>
+              <w:rPr>
+                <w:rFonts w:hint="eastAsia"/>
+                <w:sz w:val="20"/>
+                <w:szCs w:val="20"/>
+              </w:rPr>
+              <w:t xml:space="preserve"> Range</w:t>
+            </w:r>
+            <w:r>
+              <w:rPr>
+                <w:rFonts w:hint="eastAsia"/>
+                <w:sz w:val="20"/>
+                <w:szCs w:val="20"/>
+              </w:rPr>
+              <w:t>；当前构建收到</w:t>
+            </w:r>
+            <w:r>
+              <w:rPr>
+                <w:rFonts w:hint="eastAsia"/>
+                <w:sz w:val="20"/>
+                <w:szCs w:val="20"/>
+              </w:rPr>
+              <w:t xml:space="preserve"> 206 </w:t>
+            </w:r>
+            <w:r>
+              <w:rPr>
+                <w:rFonts w:hint="eastAsia"/>
+                <w:sz w:val="20"/>
+                <w:szCs w:val="20"/>
+              </w:rPr>
+              <w:t>时会以</w:t>
+            </w:r>
+            <w:r>
+              <w:rPr>
+                <w:rFonts w:hint="eastAsia"/>
+                <w:sz w:val="20"/>
+                <w:szCs w:val="20"/>
+              </w:rPr>
+              <w:t xml:space="preserve"> RANGE_MISMATCH </w:t>
+            </w:r>
+            <w:r>
+              <w:rPr>
+                <w:rFonts w:hint="eastAsia"/>
+                <w:sz w:val="20"/>
+                <w:szCs w:val="20"/>
+              </w:rPr>
+              <w:t>终止</w:t>
+            </w:r>
+          </w:p>
+        </w:tc>
+        <w:tc>
+          <w:tcPr>
+            <w:tcW w:w="1980" w:type="dxa"/>
+          </w:tcPr>
+          <w:p>
+            <w:pPr>
+              <w:pStyle w:val="Compact"/>
+            </w:pPr>
+            <w:r>
+              <w:rPr>
+                <w:rFonts w:hint="eastAsia"/>
+                <w:sz w:val="20"/>
+                <w:szCs w:val="20"/>
+              </w:rPr>
+              <w:t>恢复后按</w:t>
             </w:r>
             <w:r>
               <w:rPr>
@@ -17464,7 +17618,7 @@
                 <w:sz w:val="20"/>
                 <w:szCs w:val="20"/>
               </w:rPr>
-              <w:t>续传</w:t>
+              <w:t>继续响应</w:t>
             </w:r>
           </w:p>
         </w:tc>
@@ -17482,40 +17636,23 @@
                 <w:sz w:val="20"/>
                 <w:szCs w:val="20"/>
               </w:rPr>
-              <w:t>恢复后按</w:t>
-            </w:r>
-            <w:r>
-              <w:rPr>
-                <w:sz w:val="20"/>
-                <w:szCs w:val="20"/>
-              </w:rPr>
-              <w:t xml:space="preserve"> Range </w:t>
-            </w:r>
-            <w:r>
-              <w:rPr>
-                <w:rFonts w:hint="eastAsia"/>
-                <w:sz w:val="20"/>
-                <w:szCs w:val="20"/>
-              </w:rPr>
-              <w:t>继续响应</w:t>
-            </w:r>
-          </w:p>
-        </w:tc>
-        <w:tc>
-          <w:tcPr>
-            <w:tcW w:w="1980" w:type="dxa"/>
-          </w:tcPr>
-          <w:p>
-            <w:pPr>
-              <w:pStyle w:val="Compact"/>
-            </w:pPr>
-            <w:r>
-              <w:rPr>
-                <w:rFonts w:hint="eastAsia"/>
-                <w:sz w:val="20"/>
-                <w:szCs w:val="20"/>
-              </w:rPr>
-              <w:t>从断点继续下载</w:t>
+              <w:t>当前构建无法完成</w:t>
+            </w:r>
+            <w:r>
+              <w:rPr>
+                <w:rFonts w:hint="eastAsia"/>
+                <w:sz w:val="20"/>
+                <w:szCs w:val="20"/>
+              </w:rPr>
+              <w:t xml:space="preserve"> 206 </w:t>
+            </w:r>
+            <w:r>
+              <w:rPr>
+                <w:rFonts w:hint="eastAsia"/>
+                <w:sz w:val="20"/>
+                <w:szCs w:val="20"/>
+              </w:rPr>
+              <w:t>续传；待响应头接口适配后重新验证</w:t>
             </w:r>
           </w:p>
         </w:tc>
@@ -17553,10 +17690,11 @@
                 <w:sz w:val="20"/>
                 <w:szCs w:val="20"/>
               </w:rPr>
-              <w:t>重启后按</w:t>
-            </w:r>
-            <w:r>
-              <w:rPr>
+              <w:t>重启后读取</w:t>
+            </w:r>
+            <w:r>
+              <w:rPr>
+                <w:rFonts w:hint="eastAsia"/>
                 <w:sz w:val="20"/>
                 <w:szCs w:val="20"/>
               </w:rPr>
@@ -17568,7 +17706,23 @@
                 <w:sz w:val="20"/>
                 <w:szCs w:val="20"/>
               </w:rPr>
-              <w:t>恢复记录续传或恢复提交</w:t>
+              <w:t>恢复记录；</w:t>
+            </w:r>
+            <w:r>
+              <w:rPr>
+                <w:rFonts w:hint="eastAsia"/>
+                <w:sz w:val="20"/>
+                <w:szCs w:val="20"/>
+              </w:rPr>
+              <w:t xml:space="preserve">206 </w:t>
+            </w:r>
+            <w:r>
+              <w:rPr>
+                <w:rFonts w:hint="eastAsia"/>
+                <w:sz w:val="20"/>
+                <w:szCs w:val="20"/>
+              </w:rPr>
+              <w:t>续传受当前构建限制，已验证镜像仍可恢复提交</w:t>
             </w:r>
           </w:p>
         </w:tc>
@@ -17901,16 +18055,7 @@
                 <w:sz w:val="20"/>
                 <w:szCs w:val="20"/>
               </w:rPr>
-              <w:t>SHA-</w:t>
-            </w:r>
-            <w:r>
-              <w:rPr>
-                <w:rFonts w:hint="eastAsia"/>
-                <w:sz w:val="20"/>
-                <w:szCs w:val="20"/>
-              </w:rPr>
-              <w:lastRenderedPageBreak/>
-              <w:t>256</w:t>
+              <w:t>SHA-256</w:t>
             </w:r>
             <w:r>
               <w:rPr>
@@ -17959,7 +18104,6 @@
                 <w:sz w:val="20"/>
                 <w:szCs w:val="20"/>
               </w:rPr>
-              <w:lastRenderedPageBreak/>
               <w:t>终止并隔离当前制品</w:t>
             </w:r>
           </w:p>
@@ -17978,16 +18122,7 @@
                 <w:sz w:val="20"/>
                 <w:szCs w:val="20"/>
               </w:rPr>
-              <w:t>更换有效制品后重新</w:t>
-            </w:r>
-            <w:r>
-              <w:rPr>
-                <w:rFonts w:hint="eastAsia"/>
-                <w:sz w:val="20"/>
-                <w:szCs w:val="20"/>
-              </w:rPr>
-              <w:lastRenderedPageBreak/>
-              <w:t>下发</w:t>
+              <w:t>更换有效制品后重新下发</w:t>
             </w:r>
           </w:p>
         </w:tc>
@@ -18005,7 +18140,6 @@
                 <w:sz w:val="20"/>
                 <w:szCs w:val="20"/>
               </w:rPr>
-              <w:lastRenderedPageBreak/>
               <w:t>当前制品不可继续</w:t>
             </w:r>
           </w:p>
@@ -18210,16 +18344,43 @@
         <w:rPr>
           <w:rFonts w:hint="eastAsia"/>
         </w:rPr>
-        <w:t>恢复记录，下载阶段按有效断点续传（见下文</w:t>
-      </w:r>
-      <w:r>
+        <w:t>恢复记录，</w:t>
+      </w:r>
+      <w:r>
+        <w:rPr>
+          <w:rFonts w:hint="eastAsia"/>
+        </w:rPr>
+        <w:t>下载阶段会按有效断点发起</w:t>
+      </w:r>
+      <w:r>
+        <w:rPr>
+          <w:rFonts w:hint="eastAsia"/>
+        </w:rPr>
         <w:t xml:space="preserve"> Range </w:t>
       </w:r>
       <w:r>
         <w:rPr>
           <w:rFonts w:hint="eastAsia"/>
         </w:rPr>
-        <w:t>断点恢复），已完成校验但尚未提交时恢复提交流程（见下文已验证镜像的掉电恢复）；服务端不主动建立到终端的连接，设备重新上线并发起检查后按正常协议处理。</w:t>
+        <w:t>恢复，但当前构建的</w:t>
+      </w:r>
+      <w:r>
+        <w:rPr>
+          <w:rFonts w:hint="eastAsia"/>
+        </w:rPr>
+        <w:t xml:space="preserve"> 206 </w:t>
+      </w:r>
+      <w:r>
+        <w:rPr>
+          <w:rFonts w:hint="eastAsia"/>
+        </w:rPr>
+        <w:t>路径会因缺少响应头读取接口而失败；</w:t>
+      </w:r>
+      <w:r>
+        <w:rPr>
+          <w:rFonts w:hint="eastAsia"/>
+        </w:rPr>
+        <w:t>已完成校验但尚未提交时恢复提交流程（见下文已验证镜像的掉电恢复）；服务端不主动建立到终端的连接，设备重新上线并发起检查后按正常协议处理。</w:t>
       </w:r>
     </w:p>
     <w:p>
@@ -18279,25 +18440,79 @@
         <w:rPr>
           <w:rFonts w:hint="eastAsia"/>
         </w:rPr>
-        <w:t>从断点续传。续传响应符合</w:t>
-      </w:r>
-      <w:r>
-        <w:t xml:space="preserve"> HTTPS </w:t>
-      </w:r>
-      <w:r>
-        <w:rPr>
-          <w:rFonts w:hint="eastAsia"/>
-        </w:rPr>
-        <w:t>契约时继续写入；断点失效或服务器不支持</w:t>
-      </w:r>
-      <w:r>
+        <w:t>从断点续传。</w:t>
+      </w:r>
+      <w:r>
+        <w:rPr>
+          <w:rFonts w:hint="eastAsia"/>
+        </w:rPr>
+        <w:t>当前</w:t>
+      </w:r>
+      <w:r>
+        <w:rPr>
+          <w:rFonts w:hint="eastAsia"/>
+        </w:rPr>
+        <w:t xml:space="preserve"> ESP-IDF 5.5.4 </w:t>
+      </w:r>
+      <w:r>
+        <w:rPr>
+          <w:rFonts w:hint="eastAsia"/>
+        </w:rPr>
+        <w:t>构建无法读取校验</w:t>
+      </w:r>
+      <w:r>
+        <w:rPr>
+          <w:rFonts w:hint="eastAsia"/>
+        </w:rPr>
+        <w:t xml:space="preserve"> 206 </w:t>
+      </w:r>
+      <w:r>
+        <w:rPr>
+          <w:rFonts w:hint="eastAsia"/>
+        </w:rPr>
+        <w:t>所需的响应头，会以</w:t>
+      </w:r>
+      <w:r>
+        <w:rPr>
+          <w:rFonts w:hint="eastAsia"/>
+        </w:rPr>
+        <w:t xml:space="preserve"> RANGE_MISMATCH </w:t>
+      </w:r>
+      <w:r>
+        <w:rPr>
+          <w:rFonts w:hint="eastAsia"/>
+        </w:rPr>
+        <w:t>终止；完成接口适配并通过</w:t>
+      </w:r>
+      <w:r>
+        <w:rPr>
+          <w:rFonts w:hint="eastAsia"/>
+        </w:rPr>
+        <w:t xml:space="preserve"> OTA-06 </w:t>
+      </w:r>
+      <w:r>
+        <w:rPr>
+          <w:rFonts w:hint="eastAsia"/>
+        </w:rPr>
+        <w:t>前，不得把该路径标为可用。断点失效或服务器不支持</w:t>
+      </w:r>
+      <w:r>
+        <w:rPr>
+          <w:rFonts w:hint="eastAsia"/>
+        </w:rPr>
         <w:t xml:space="preserve"> Range </w:t>
       </w:r>
       <w:r>
         <w:rPr>
           <w:rFonts w:hint="eastAsia"/>
         </w:rPr>
-        <w:t>时回退一次全量下载；响应范围不匹配时终止传输、不提交固件，并隔离当前制品。</w:t>
+        <w:t>时回退一次全量下载；</w:t>
+      </w:r>
+      <w:r>
+        <w:rPr>
+          <w:rFonts w:hint="eastAsia"/>
+        </w:rPr>
+        <w:t>响应范围不匹配时终止传输、不提交固件，并隔离当前制品。</w:t>
       </w:r>
     </w:p>
     <w:p>
@@ -18428,7 +18643,6 @@
         <w:pStyle w:val="a0"/>
       </w:pPr>
       <w:r>
-        <w:lastRenderedPageBreak/>
         <w:t>以下示例用于说明</w:t>
       </w:r>
       <w:r>
@@ -18631,7 +18845,19 @@
         <w:rPr>
           <w:rStyle w:val="StringTok"/>
         </w:rPr>
-        <w:t>"native-ota-device"</w:t>
+        <w:t>"</w:t>
+      </w:r>
+      <w:r>
+        <w:rPr>
+          <w:rStyle w:val="StringTok"/>
+        </w:rPr>
+        <w:t>julia-ai-device</w:t>
+      </w:r>
+      <w:r>
+        <w:rPr>
+          <w:rStyle w:val="StringTok"/>
+        </w:rPr>
+        <w:t>"</w:t>
       </w:r>
       <w:r>
         <w:rPr>
@@ -18929,7 +19155,19 @@
         <w:rPr>
           <w:rStyle w:val="StringTok"/>
         </w:rPr>
-        <w:t>"native-ota-device"</w:t>
+        <w:t>"</w:t>
+      </w:r>
+      <w:r>
+        <w:rPr>
+          <w:rStyle w:val="StringTok"/>
+        </w:rPr>
+        <w:t>julia-ai-device</w:t>
+      </w:r>
+      <w:r>
+        <w:rPr>
+          <w:rStyle w:val="StringTok"/>
+        </w:rPr>
+        <w:t>"</w:t>
       </w:r>
       <w:r>
         <w:rPr>
@@ -19237,7 +19475,19 @@
         <w:rPr>
           <w:rStyle w:val="StringTok"/>
         </w:rPr>
-        <w:t>"native-ota-device"</w:t>
+        <w:t>"</w:t>
+      </w:r>
+      <w:r>
+        <w:rPr>
+          <w:rStyle w:val="StringTok"/>
+        </w:rPr>
+        <w:t>julia-ai-device</w:t>
+      </w:r>
+      <w:r>
+        <w:rPr>
+          <w:rStyle w:val="StringTok"/>
+        </w:rPr>
+        <w:t>"</w:t>
       </w:r>
       <w:r>
         <w:rPr>
@@ -19627,7 +19877,6 @@
           <w:color w:val="auto"/>
           <w:sz w:val="24"/>
         </w:rPr>
-        <w:lastRenderedPageBreak/>
         <w:t>服务端通知仅用于触发设备重新进行版本检查；设备收到合法升级响应并进入</w:t>
       </w:r>
       <w:r>
@@ -20121,7 +20370,19 @@
         <w:rPr>
           <w:rStyle w:val="StringTok"/>
         </w:rPr>
-        <w:t>"native-ota-device"</w:t>
+        <w:t>"</w:t>
+      </w:r>
+      <w:r>
+        <w:rPr>
+          <w:rStyle w:val="StringTok"/>
+        </w:rPr>
+        <w:t>julia-ai-device</w:t>
+      </w:r>
+      <w:r>
+        <w:rPr>
+          <w:rStyle w:val="StringTok"/>
+        </w:rPr>
+        <w:t>"</w:t>
       </w:r>
       <w:r>
         <w:rPr>
@@ -20821,7 +21082,19 @@
         <w:rPr>
           <w:rStyle w:val="StringTok"/>
         </w:rPr>
-        <w:t>"native-ota-device"</w:t>
+        <w:t>"</w:t>
+      </w:r>
+      <w:r>
+        <w:rPr>
+          <w:rStyle w:val="StringTok"/>
+        </w:rPr>
+        <w:t>julia-ai-device</w:t>
+      </w:r>
+      <w:r>
+        <w:rPr>
+          <w:rStyle w:val="StringTok"/>
+        </w:rPr>
+        <w:t>"</w:t>
       </w:r>
       <w:r>
         <w:rPr>
@@ -21070,7 +21343,6 @@
         <w:rPr>
           <w:rStyle w:val="NormalTok"/>
         </w:rPr>
-        <w:lastRenderedPageBreak/>
         <w:t xml:space="preserve">  </w:t>
       </w:r>
       <w:r>
@@ -21327,7 +21599,7 @@
 </file>
 
 <file path=word/endnotes.xml><?xml version="1.0" encoding="utf-8"?>
-<w:endnotes xmlns:wpc="http://schemas.microsoft.com/office/word/2010/wordprocessingCanvas" xmlns:cx="http://schemas.microsoft.com/office/drawing/2014/chartex" xmlns:cx1="http://schemas.microsoft.com/office/drawing/2015/9/8/chartex" xmlns:cx2="http://schemas.microsoft.com/office/drawing/2015/10/21/chartex" xmlns:cx3="http://schemas.microsoft.com/office/drawing/2016/5/9/chartex" xmlns:cx4="http://schemas.microsoft.com/office/drawing/2016/5/10/chartex" xmlns:cx5="http://schemas.microsoft.com/office/drawing/2016/5/11/chartex" xmlns:cx6="http://schemas.microsoft.com/office/drawing/2016/5/12/chartex" xmlns:cx7="http://schemas.microsoft.com/office/drawing/2016/5/13/chartex" xmlns:cx8="http://schemas.microsoft.com/office/drawing/2016/5/14/chartex" xmlns:mc="http://schemas.openxmlformats.org/markup-compatibility/2006" xmlns:aink="http://schemas.microsoft.com/office/drawing/2016/ink" xmlns:am3d="http://schemas.microsoft.com/office/drawing/2017/model3d" xmlns:o="urn:schemas-microsoft-com:office:office" xmlns:oel="http://schemas.microsoft.com/office/2019/extlst" xmlns:r="http://schemas.openxmlformats.org/officeDocument/2006/relationships" xmlns:m="http://schemas.openxmlformats.org/officeDocument/2006/math" xmlns:v="urn:schemas-microsoft-com:vml" xmlns:wp14="http://schemas.microsoft.com/office/word/2010/wordprocessingDrawing" xmlns:wp="http://schemas.openxmlformats.org/drawingml/2006/wordprocessingDrawing" xmlns:w10="urn:schemas-microsoft-com:office:word" xmlns:w="http://schemas.openxmlformats.org/wordprocessingml/2006/main" xmlns:w14="http://schemas.microsoft.com/office/word/2010/wordml" xmlns:w15="http://schemas.microsoft.com/office/word/2012/wordml" xmlns:w16cei="http://schemas.microsoft.com/office/word/2026/wordml/cei" xmlns:w16cex="http://schemas.microsoft.com/office/word/2018/wordml/cex" xmlns:w16cid="http://schemas.microsoft.com/office/word/2016/wordml/cid" xmlns:w16="http://schemas.microsoft.com/office/word/2018/wordml" xmlns:w16du="http://schemas.microsoft.com/office/word/2023/wordml/word16du" xmlns:w16sdtdh="http://schemas.microsoft.com/office/word/2020/wordml/sdtdatahash" xmlns:w16sdtfl="http://schemas.microsoft.com/office/word/2024/wordml/sdtformatlock" xmlns:w16se="http://schemas.microsoft.com/office/word/2015/wordml/symex" xmlns:wpg="http://schemas.microsoft.com/office/word/2010/wordprocessingGroup" xmlns:wpi="http://schemas.microsoft.com/office/word/2010/wordprocessingInk" xmlns:wne="http://schemas.microsoft.com/office/word/2006/wordml" xmlns:wps="http://schemas.microsoft.com/office/word/2010/wordprocessingShape" mc:Ignorable="w14 w15 w16se w16cid w16 w16cex w16sdtdh w16sdtfl w16du wp14">
+<w:endnotes xmlns:wpc="http://schemas.microsoft.com/office/word/2010/wordprocessingCanvas" xmlns:cx="http://schemas.microsoft.com/office/drawing/2014/chartex" xmlns:cx1="http://schemas.microsoft.com/office/drawing/2015/9/8/chartex" xmlns:cx2="http://schemas.microsoft.com/office/drawing/2015/10/21/chartex" xmlns:cx3="http://schemas.microsoft.com/office/drawing/2016/5/9/chartex" xmlns:cx4="http://schemas.microsoft.com/office/drawing/2016/5/10/chartex" xmlns:cx5="http://schemas.microsoft.com/office/drawing/2016/5/11/chartex" xmlns:cx6="http://schemas.microsoft.com/office/drawing/2016/5/12/chartex" xmlns:cx7="http://schemas.microsoft.com/office/drawing/2016/5/13/chartex" xmlns:cx8="http://schemas.microsoft.com/office/drawing/2016/5/14/chartex" xmlns:mc="http://schemas.openxmlformats.org/markup-compatibility/2006" xmlns:aink="http://schemas.microsoft.com/office/drawing/2016/ink" xmlns:am3d="http://schemas.microsoft.com/office/drawing/2017/model3d" xmlns:o="urn:schemas-microsoft-com:office:office" xmlns:oel="http://schemas.microsoft.com/office/2019/extlst" xmlns:r="http://schemas.openxmlformats.org/officeDocument/2006/relationships" xmlns:m="http://schemas.openxmlformats.org/officeDocument/2006/math" xmlns:v="urn:schemas-microsoft-com:vml" xmlns:wp14="http://schemas.microsoft.com/office/word/2010/wordprocessingDrawing" xmlns:wp="http://schemas.openxmlformats.org/drawingml/2006/wordprocessingDrawing" xmlns:w10="urn:schemas-microsoft-com:office:word" xmlns:w="http://schemas.openxmlformats.org/wordprocessingml/2006/main" xmlns:w14="http://schemas.microsoft.com/office/word/2010/wordml" xmlns:w15="http://schemas.microsoft.com/office/word/2012/wordml" xmlns:w16cex="http://schemas.microsoft.com/office/word/2018/wordml/cex" xmlns:w16cid="http://schemas.microsoft.com/office/word/2016/wordml/cid" xmlns:w16="http://schemas.microsoft.com/office/word/2018/wordml" xmlns:w16du="http://schemas.microsoft.com/office/word/2023/wordml/word16du" xmlns:w16sdtdh="http://schemas.microsoft.com/office/word/2020/wordml/sdtdatahash" xmlns:w16sdtfl="http://schemas.microsoft.com/office/word/2024/wordml/sdtformatlock" xmlns:w16se="http://schemas.microsoft.com/office/word/2015/wordml/symex" xmlns:wpg="http://schemas.microsoft.com/office/word/2010/wordprocessingGroup" xmlns:wpi="http://schemas.microsoft.com/office/word/2010/wordprocessingInk" xmlns:wne="http://schemas.microsoft.com/office/word/2006/wordml" xmlns:wps="http://schemas.microsoft.com/office/word/2010/wordprocessingShape" mc:Ignorable="w14 w15 w16se w16cid w16 w16cex w16sdtdh w16sdtfl w16du wp14">
   <w:endnote w:type="separator" w:id="-1">
     <w:p>
       <w:pPr>
@@ -21352,7 +21624,7 @@
 </file>
 
 <file path=word/footnotes.xml><?xml version="1.0" encoding="utf-8"?>
-<w:footnotes xmlns:wpc="http://schemas.microsoft.com/office/word/2010/wordprocessingCanvas" xmlns:cx="http://schemas.microsoft.com/office/drawing/2014/chartex" xmlns:cx1="http://schemas.microsoft.com/office/drawing/2015/9/8/chartex" xmlns:cx2="http://schemas.microsoft.com/office/drawing/2015/10/21/chartex" xmlns:cx3="http://schemas.microsoft.com/office/drawing/2016/5/9/chartex" xmlns:cx4="http://schemas.microsoft.com/office/drawing/2016/5/10/chartex" xmlns:cx5="http://schemas.microsoft.com/office/drawing/2016/5/11/chartex" xmlns:cx6="http://schemas.microsoft.com/office/drawing/2016/5/12/chartex" xmlns:cx7="http://schemas.microsoft.com/office/drawing/2016/5/13/chartex" xmlns:cx8="http://schemas.microsoft.com/office/drawing/2016/5/14/chartex" xmlns:mc="http://schemas.openxmlformats.org/markup-compatibility/2006" xmlns:aink="http://schemas.microsoft.com/office/drawing/2016/ink" xmlns:am3d="http://schemas.microsoft.com/office/drawing/2017/model3d" xmlns:o="urn:schemas-microsoft-com:office:office" xmlns:oel="http://schemas.microsoft.com/office/2019/extlst" xmlns:r="http://schemas.openxmlformats.org/officeDocument/2006/relationships" xmlns:m="http://schemas.openxmlformats.org/officeDocument/2006/math" xmlns:v="urn:schemas-microsoft-com:vml" xmlns:wp14="http://schemas.microsoft.com/office/word/2010/wordprocessingDrawing" xmlns:wp="http://schemas.openxmlformats.org/drawingml/2006/wordprocessingDrawing" xmlns:w10="urn:schemas-microsoft-com:office:word" xmlns:w="http://schemas.openxmlformats.org/wordprocessingml/2006/main" xmlns:w14="http://schemas.microsoft.com/office/word/2010/wordml" xmlns:w15="http://schemas.microsoft.com/office/word/2012/wordml" xmlns:w16cei="http://schemas.microsoft.com/office/word/2026/wordml/cei" xmlns:w16cex="http://schemas.microsoft.com/office/word/2018/wordml/cex" xmlns:w16cid="http://schemas.microsoft.com/office/word/2016/wordml/cid" xmlns:w16="http://schemas.microsoft.com/office/word/2018/wordml" xmlns:w16du="http://schemas.microsoft.com/office/word/2023/wordml/word16du" xmlns:w16sdtdh="http://schemas.microsoft.com/office/word/2020/wordml/sdtdatahash" xmlns:w16sdtfl="http://schemas.microsoft.com/office/word/2024/wordml/sdtformatlock" xmlns:w16se="http://schemas.microsoft.com/office/word/2015/wordml/symex" xmlns:wpg="http://schemas.microsoft.com/office/word/2010/wordprocessingGroup" xmlns:wpi="http://schemas.microsoft.com/office/word/2010/wordprocessingInk" xmlns:wne="http://schemas.microsoft.com/office/word/2006/wordml" xmlns:wps="http://schemas.microsoft.com/office/word/2010/wordprocessingShape" mc:Ignorable="w14 w15 w16se w16cid w16 w16cex w16sdtdh w16sdtfl w16du wp14">
+<w:footnotes xmlns:wpc="http://schemas.microsoft.com/office/word/2010/wordprocessingCanvas" xmlns:cx="http://schemas.microsoft.com/office/drawing/2014/chartex" xmlns:cx1="http://schemas.microsoft.com/office/drawing/2015/9/8/chartex" xmlns:cx2="http://schemas.microsoft.com/office/drawing/2015/10/21/chartex" xmlns:cx3="http://schemas.microsoft.com/office/drawing/2016/5/9/chartex" xmlns:cx4="http://schemas.microsoft.com/office/drawing/2016/5/10/chartex" xmlns:cx5="http://schemas.microsoft.com/office/drawing/2016/5/11/chartex" xmlns:cx6="http://schemas.microsoft.com/office/drawing/2016/5/12/chartex" xmlns:cx7="http://schemas.microsoft.com/office/drawing/2016/5/13/chartex" xmlns:cx8="http://schemas.microsoft.com/office/drawing/2016/5/14/chartex" xmlns:mc="http://schemas.openxmlformats.org/markup-compatibility/2006" xmlns:aink="http://schemas.microsoft.com/office/drawing/2016/ink" xmlns:am3d="http://schemas.microsoft.com/office/drawing/2017/model3d" xmlns:o="urn:schemas-microsoft-com:office:office" xmlns:oel="http://schemas.microsoft.com/office/2019/extlst" xmlns:r="http://schemas.openxmlformats.org/officeDocument/2006/relationships" xmlns:m="http://schemas.openxmlformats.org/officeDocument/2006/math" xmlns:v="urn:schemas-microsoft-com:vml" xmlns:wp14="http://schemas.microsoft.com/office/word/2010/wordprocessingDrawing" xmlns:wp="http://schemas.openxmlformats.org/drawingml/2006/wordprocessingDrawing" xmlns:w10="urn:schemas-microsoft-com:office:word" xmlns:w="http://schemas.openxmlformats.org/wordprocessingml/2006/main" xmlns:w14="http://schemas.microsoft.com/office/word/2010/wordml" xmlns:w15="http://schemas.microsoft.com/office/word/2012/wordml" xmlns:w16cex="http://schemas.microsoft.com/office/word/2018/wordml/cex" xmlns:w16cid="http://schemas.microsoft.com/office/word/2016/wordml/cid" xmlns:w16="http://schemas.microsoft.com/office/word/2018/wordml" xmlns:w16du="http://schemas.microsoft.com/office/word/2023/wordml/word16du" xmlns:w16sdtdh="http://schemas.microsoft.com/office/word/2020/wordml/sdtdatahash" xmlns:w16sdtfl="http://schemas.microsoft.com/office/word/2024/wordml/sdtformatlock" xmlns:w16se="http://schemas.microsoft.com/office/word/2015/wordml/symex" xmlns:wpg="http://schemas.microsoft.com/office/word/2010/wordprocessingGroup" xmlns:wpi="http://schemas.microsoft.com/office/word/2010/wordprocessingInk" xmlns:wne="http://schemas.microsoft.com/office/word/2006/wordml" xmlns:wps="http://schemas.microsoft.com/office/word/2010/wordprocessingShape" mc:Ignorable="w14 w15 w16se w16cid w16 w16cex w16sdtdh w16sdtfl w16du wp14">
   <w:footnote w:type="separator" w:id="-1">
     <w:p>
       <w:pPr>
@@ -21377,7 +21649,7 @@
 </file>
 
 <file path=word/numbering.xml><?xml version="1.0" encoding="utf-8"?>
-<w:numbering xmlns:wpc="http://schemas.microsoft.com/office/word/2010/wordprocessingCanvas" xmlns:cx="http://schemas.microsoft.com/office/drawing/2014/chartex" xmlns:cx1="http://schemas.microsoft.com/office/drawing/2015/9/8/chartex" xmlns:cx2="http://schemas.microsoft.com/office/drawing/2015/10/21/chartex" xmlns:cx3="http://schemas.microsoft.com/office/drawing/2016/5/9/chartex" xmlns:cx4="http://schemas.microsoft.com/office/drawing/2016/5/10/chartex" xmlns:cx5="http://schemas.microsoft.com/office/drawing/2016/5/11/chartex" xmlns:cx6="http://schemas.microsoft.com/office/drawing/2016/5/12/chartex" xmlns:cx7="http://schemas.microsoft.com/office/drawing/2016/5/13/chartex" xmlns:cx8="http://schemas.microsoft.com/office/drawing/2016/5/14/chartex" xmlns:mc="http://schemas.openxmlformats.org/markup-compatibility/2006" xmlns:aink="http://schemas.microsoft.com/office/drawing/2016/ink" xmlns:am3d="http://schemas.microsoft.com/office/drawing/2017/model3d" xmlns:o="urn:schemas-microsoft-com:office:office" xmlns:oel="http://schemas.microsoft.com/office/2019/extlst" xmlns:r="http://schemas.openxmlformats.org/officeDocument/2006/relationships" xmlns:m="http://schemas.openxmlformats.org/officeDocument/2006/math" xmlns:v="urn:schemas-microsoft-com:vml" xmlns:wp14="http://schemas.microsoft.com/office/word/2010/wordprocessingDrawing" xmlns:wp="http://schemas.openxmlformats.org/drawingml/2006/wordprocessingDrawing" xmlns:w10="urn:schemas-microsoft-com:office:word" xmlns:w="http://schemas.openxmlformats.org/wordprocessingml/2006/main" xmlns:w14="http://schemas.microsoft.com/office/word/2010/wordml" xmlns:w15="http://schemas.microsoft.com/office/word/2012/wordml" xmlns:w16cei="http://schemas.microsoft.com/office/word/2026/wordml/cei" xmlns:w16cex="http://schemas.microsoft.com/office/word/2018/wordml/cex" xmlns:w16cid="http://schemas.microsoft.com/office/word/2016/wordml/cid" xmlns:w16="http://schemas.microsoft.com/office/word/2018/wordml" xmlns:w16du="http://schemas.microsoft.com/office/word/2023/wordml/word16du" xmlns:w16sdtdh="http://schemas.microsoft.com/office/word/2020/wordml/sdtdatahash" xmlns:w16sdtfl="http://schemas.microsoft.com/office/word/2024/wordml/sdtformatlock" xmlns:w16se="http://schemas.microsoft.com/office/word/2015/wordml/symex" xmlns:wpg="http://schemas.microsoft.com/office/word/2010/wordprocessingGroup" xmlns:wpi="http://schemas.microsoft.com/office/word/2010/wordprocessingInk" xmlns:wne="http://schemas.microsoft.com/office/word/2006/wordml" xmlns:wps="http://schemas.microsoft.com/office/word/2010/wordprocessingShape" mc:Ignorable="w14 w15 w16se w16cid w16 w16cex w16sdtdh w16sdtfl w16du wp14">
+<w:numbering xmlns:wpc="http://schemas.microsoft.com/office/word/2010/wordprocessingCanvas" xmlns:cx="http://schemas.microsoft.com/office/drawing/2014/chartex" xmlns:cx1="http://schemas.microsoft.com/office/drawing/2015/9/8/chartex" xmlns:cx2="http://schemas.microsoft.com/office/drawing/2015/10/21/chartex" xmlns:cx3="http://schemas.microsoft.com/office/drawing/2016/5/9/chartex" xmlns:cx4="http://schemas.microsoft.com/office/drawing/2016/5/10/chartex" xmlns:cx5="http://schemas.microsoft.com/office/drawing/2016/5/11/chartex" xmlns:cx6="http://schemas.microsoft.com/office/drawing/2016/5/12/chartex" xmlns:cx7="http://schemas.microsoft.com/office/drawing/2016/5/13/chartex" xmlns:cx8="http://schemas.microsoft.com/office/drawing/2016/5/14/chartex" xmlns:mc="http://schemas.openxmlformats.org/markup-compatibility/2006" xmlns:aink="http://schemas.microsoft.com/office/drawing/2016/ink" xmlns:am3d="http://schemas.microsoft.com/office/drawing/2017/model3d" xmlns:o="urn:schemas-microsoft-com:office:office" xmlns:oel="http://schemas.microsoft.com/office/2019/extlst" xmlns:r="http://schemas.openxmlformats.org/officeDocument/2006/relationships" xmlns:m="http://schemas.openxmlformats.org/officeDocument/2006/math" xmlns:v="urn:schemas-microsoft-com:vml" xmlns:wp14="http://schemas.microsoft.com/office/word/2010/wordprocessingDrawing" xmlns:wp="http://schemas.openxmlformats.org/drawingml/2006/wordprocessingDrawing" xmlns:w10="urn:schemas-microsoft-com:office:word" xmlns:w="http://schemas.openxmlformats.org/wordprocessingml/2006/main" xmlns:w14="http://schemas.microsoft.com/office/word/2010/wordml" xmlns:w15="http://schemas.microsoft.com/office/word/2012/wordml" xmlns:w16cex="http://schemas.microsoft.com/office/word/2018/wordml/cex" xmlns:w16cid="http://schemas.microsoft.com/office/word/2016/wordml/cid" xmlns:w16="http://schemas.microsoft.com/office/word/2018/wordml" xmlns:w16du="http://schemas.microsoft.com/office/word/2023/wordml/word16du" xmlns:w16sdtdh="http://schemas.microsoft.com/office/word/2020/wordml/sdtdatahash" xmlns:w16sdtfl="http://schemas.microsoft.com/office/word/2024/wordml/sdtformatlock" xmlns:w16se="http://schemas.microsoft.com/office/word/2015/wordml/symex" xmlns:wpg="http://schemas.microsoft.com/office/word/2010/wordprocessingGroup" xmlns:wpi="http://schemas.microsoft.com/office/word/2010/wordprocessingInk" xmlns:wne="http://schemas.microsoft.com/office/word/2006/wordml" xmlns:wps="http://schemas.microsoft.com/office/word/2010/wordprocessingShape" mc:Ignorable="w14 w15 w16se w16cid w16 w16cex w16sdtdh w16sdtfl w16du wp14">
   <w:abstractNum w:abstractNumId="0" w15:restartNumberingAfterBreak="0">
     <w:nsid w:val="0000A990"/>
     <w:multiLevelType w:val="multilevel"/>

</xml_diff>